<commit_message>
feat(dvr): testi predefiniti per galleria tradizionale, TBM e opere all'aperto
I modelli coprono un solo ambiente per rischio (chimici, posture e ROA
Castagnola in scavo tradizionale; rumore, vibrazioni e MMC Xenia TBM):
i testi fissi ora cambiano con gli ambiti del documento.
- chimico, cancerogeno, amianto: misure adottate e piano per scavo
  tradizionale, TBM e opere all'aperto (nota sui gas all'aperto);
- posture: operazioni ordinarie e luogo per tradizionale, TBM, esterno;
- vibrazioni: sorgenti WBV dell'analisi preliminare secondo gli ambiti.
Helper comune contestoAmbiti e test sulle varianti.

Co-Authored-By: Claude Opus 5.5 <noreply@anthropic.com>
Claude-Session: https://claude.ai/code/session_01UFrHEpZ45TUB6Ew485d3AX
</commit_message>
<xml_diff>
--- a/public/templates/dvr/posture.docx
+++ b/public/templates/dvr/posture.docx
@@ -6125,31 +6125,31 @@
         <w:rPr>
           <w:rFonts w:ascii="Verdana" w:hAnsi="Verdana"/>
         </w:rPr>
-        <w:t xml:space="preserve">Si tratta di tutte quelle attività che generalmente indichiamo come “operazioni ordinarie {inLuogo}” e che possono essere il prolungamento delle tubazioni di aria compressa ed acqua, l’allungamento del tubo di ventilazione, l’assembla</w:t>
-      </w:r>
-      <w:r>
-        <w:rPr>
-          <w:rFonts w:ascii="Verdana" w:hAnsi="Verdana"/>
-        </w:rPr>
-        <w:t>ggio</w:t>
-      </w:r>
-      <w:r>
-        <w:rPr>
-          <w:rFonts w:ascii="Verdana" w:hAnsi="Verdana"/>
-        </w:rPr>
-        <w:t xml:space="preserve"> di armature e ferri (centine, ferri delle murette e dei marciapiedi, ecc,), la pulizia e la manutenzione ordinaria dei mezzi</w:t>
-      </w:r>
-      <w:r>
-        <w:rPr>
-          <w:rFonts w:ascii="Verdana" w:hAnsi="Verdana"/>
-        </w:rPr>
-        <w:t xml:space="preserve">, </w:t>
-      </w:r>
-      <w:r>
-        <w:rPr>
-          <w:rFonts w:ascii="Verdana" w:hAnsi="Verdana"/>
-        </w:rPr>
-        <w:t>il montaggio delle plafoniere, ecc.</w:t>
+        <w:t xml:space="preserve">Si tratta di tutte quelle attività che generalmente indichiamo come “operazioni ordinarie {inLuogo}” e che possono essere {operazioniOrdinarie}.</w:t>
+      </w:r>
+      <w:r>
+        <w:rPr>
+          <w:rFonts w:ascii="Verdana" w:hAnsi="Verdana"/>
+        </w:rPr>
+        <w:t/>
+      </w:r>
+      <w:r>
+        <w:rPr>
+          <w:rFonts w:ascii="Verdana" w:hAnsi="Verdana"/>
+        </w:rPr>
+        <w:t xml:space="preserve"/>
+      </w:r>
+      <w:r>
+        <w:rPr>
+          <w:rFonts w:ascii="Verdana" w:hAnsi="Verdana"/>
+        </w:rPr>
+        <w:t xml:space="preserve"/>
+      </w:r>
+      <w:r>
+        <w:rPr>
+          <w:rFonts w:ascii="Verdana" w:hAnsi="Verdana"/>
+        </w:rPr>
+        <w:t/>
       </w:r>
     </w:p>
     <w:p>

</xml_diff>